<commit_message>
add /spy api in word and apidoc
</commit_message>
<xml_diff>
--- a/Documents/BaziGardan_doc.docx
+++ b/Documents/BaziGardan_doc.docx
@@ -10186,7 +10186,28 @@
           <w:rFonts w:ascii="Vazir" w:hAnsi="Vazir" w:cs="Vazir"/>
           <w:lang w:val="en" w:bidi="fa-IR"/>
         </w:rPr>
-        <w:t xml:space="preserve">POST /games/sessions/ </w:t>
+        <w:t>POST /games</w:t>
+      </w:r>
+      <w:r>
+        <w:rPr>
+          <w:rFonts w:ascii="Vazir" w:hAnsi="Vazir" w:cs="Vazir"/>
+          <w:lang w:val="en" w:bidi="fa-IR"/>
+        </w:rPr>
+        <w:t>/</w:t>
+      </w:r>
+      <w:r>
+        <w:rPr>
+          <w:rFonts w:ascii="Vazir" w:hAnsi="Vazir" w:cs="Vazir"/>
+          <w:lang w:bidi="fa-IR"/>
+        </w:rPr>
+        <w:t>spy</w:t>
+      </w:r>
+      <w:r>
+        <w:rPr>
+          <w:rFonts w:ascii="Vazir" w:hAnsi="Vazir" w:cs="Vazir"/>
+          <w:lang w:val="en" w:bidi="fa-IR"/>
+        </w:rPr>
+        <w:t xml:space="preserve">/sessions/ </w:t>
       </w:r>
       <w:r>
         <w:rPr>
@@ -10251,46 +10272,6 @@
           <w:lang w:bidi="fa-IR"/>
         </w:rPr>
         <w:t>{</w:t>
-      </w:r>
-    </w:p>
-    <w:p>
-      <w:pPr>
-        <w:rPr>
-          <w:rFonts w:ascii="Vazir" w:hAnsi="Vazir" w:cs="Vazir"/>
-          <w:lang w:bidi="fa-IR"/>
-        </w:rPr>
-      </w:pPr>
-      <w:r>
-        <w:rPr>
-          <w:rFonts w:ascii="Vazir" w:hAnsi="Vazir" w:cs="Vazir"/>
-          <w:lang w:bidi="fa-IR"/>
-        </w:rPr>
-        <w:t xml:space="preserve">  "</w:t>
-      </w:r>
-      <w:proofErr w:type="spellStart"/>
-      <w:proofErr w:type="gramStart"/>
-      <w:r>
-        <w:rPr>
-          <w:rFonts w:ascii="Vazir" w:hAnsi="Vazir" w:cs="Vazir"/>
-          <w:lang w:bidi="fa-IR"/>
-        </w:rPr>
-        <w:t>game</w:t>
-      </w:r>
-      <w:proofErr w:type="gramEnd"/>
-      <w:r>
-        <w:rPr>
-          <w:rFonts w:ascii="Vazir" w:hAnsi="Vazir" w:cs="Vazir"/>
-          <w:lang w:bidi="fa-IR"/>
-        </w:rPr>
-        <w:t>_type</w:t>
-      </w:r>
-      <w:proofErr w:type="spellEnd"/>
-      <w:r>
-        <w:rPr>
-          <w:rFonts w:ascii="Vazir" w:hAnsi="Vazir" w:cs="Vazir"/>
-          <w:lang w:bidi="fa-IR"/>
-        </w:rPr>
-        <w:t>": "spy",</w:t>
       </w:r>
     </w:p>
     <w:p>
@@ -10648,6 +10629,7 @@
           <w:bCs/>
           <w:lang w:val="en" w:bidi="fa-IR"/>
         </w:rPr>
+        <w:lastRenderedPageBreak/>
         <w:t>Exception Flows:</w:t>
       </w:r>
     </w:p>
@@ -11068,7 +11050,21 @@
           <w:rFonts w:ascii="Vazir" w:hAnsi="Vazir" w:cs="Vazir"/>
           <w:lang w:val="en" w:bidi="fa-IR"/>
         </w:rPr>
-        <w:t>GET /games/sessions/{id}/reveal/</w:t>
+        <w:t>GET /games</w:t>
+      </w:r>
+      <w:r>
+        <w:rPr>
+          <w:rFonts w:ascii="Vazir" w:hAnsi="Vazir" w:cs="Vazir"/>
+          <w:lang w:val="en" w:bidi="fa-IR"/>
+        </w:rPr>
+        <w:t>/spy</w:t>
+      </w:r>
+      <w:r>
+        <w:rPr>
+          <w:rFonts w:ascii="Vazir" w:hAnsi="Vazir" w:cs="Vazir"/>
+          <w:lang w:val="en" w:bidi="fa-IR"/>
+        </w:rPr>
+        <w:t>/sessions/{id}/reveal/</w:t>
       </w:r>
     </w:p>
     <w:p>
@@ -11163,7 +11159,28 @@
           <w:rFonts w:ascii="Vazir" w:hAnsi="Vazir" w:cs="Vazir"/>
           <w:lang w:val="en" w:bidi="fa-IR"/>
         </w:rPr>
-        <w:t xml:space="preserve">POST /games/sessions/{id}/reveal/ </w:t>
+        <w:t>POST /games</w:t>
+      </w:r>
+      <w:r>
+        <w:rPr>
+          <w:rFonts w:ascii="Vazir" w:hAnsi="Vazir" w:cs="Vazir"/>
+          <w:lang w:val="en" w:bidi="fa-IR"/>
+        </w:rPr>
+        <w:t>/spy</w:t>
+      </w:r>
+      <w:r>
+        <w:rPr>
+          <w:rFonts w:ascii="Vazir" w:hAnsi="Vazir" w:cs="Vazir"/>
+          <w:lang w:val="en" w:bidi="fa-IR"/>
+        </w:rPr>
+        <w:t xml:space="preserve"> </w:t>
+      </w:r>
+      <w:r>
+        <w:rPr>
+          <w:rFonts w:ascii="Vazir" w:hAnsi="Vazir" w:cs="Vazir"/>
+          <w:lang w:val="en" w:bidi="fa-IR"/>
+        </w:rPr>
+        <w:t xml:space="preserve">/sessions/{id}/reveal/ </w:t>
       </w:r>
       <w:r>
         <w:rPr>
@@ -11447,7 +11464,6 @@
           <w:rtl/>
           <w:lang w:val="en" w:bidi="fa-IR"/>
         </w:rPr>
-        <w:lastRenderedPageBreak/>
         <w:t xml:space="preserve">بعد از آخرین نفر: </w:t>
       </w:r>
       <w:r>
@@ -11772,7 +11788,28 @@
           <w:rFonts w:ascii="Vazir" w:hAnsi="Vazir" w:cs="Vazir" w:hint="cs"/>
           <w:lang w:bidi="fa-IR"/>
         </w:rPr>
-        <w:t>GET /games/sessions/{id}/timer</w:t>
+        <w:t>GET /games</w:t>
+      </w:r>
+      <w:r>
+        <w:rPr>
+          <w:rFonts w:ascii="Vazir" w:hAnsi="Vazir" w:cs="Vazir"/>
+          <w:lang w:val="en" w:bidi="fa-IR"/>
+        </w:rPr>
+        <w:t>/spy</w:t>
+      </w:r>
+      <w:r>
+        <w:rPr>
+          <w:rFonts w:ascii="Vazir" w:hAnsi="Vazir" w:cs="Vazir" w:hint="cs"/>
+          <w:lang w:bidi="fa-IR"/>
+        </w:rPr>
+        <w:t xml:space="preserve"> </w:t>
+      </w:r>
+      <w:r>
+        <w:rPr>
+          <w:rFonts w:ascii="Vazir" w:hAnsi="Vazir" w:cs="Vazir" w:hint="cs"/>
+          <w:lang w:bidi="fa-IR"/>
+        </w:rPr>
+        <w:t>/sessions/{id}/timer</w:t>
       </w:r>
       <w:r>
         <w:rPr>
@@ -11856,7 +11893,28 @@
           <w:rFonts w:ascii="Vazir" w:hAnsi="Vazir" w:cs="Vazir"/>
           <w:lang w:val="en" w:bidi="fa-IR"/>
         </w:rPr>
-        <w:t>POST /games/sessions/{id}/timer/pause/</w:t>
+        <w:t>POST /games</w:t>
+      </w:r>
+      <w:r>
+        <w:rPr>
+          <w:rFonts w:ascii="Vazir" w:hAnsi="Vazir" w:cs="Vazir"/>
+          <w:lang w:val="en" w:bidi="fa-IR"/>
+        </w:rPr>
+        <w:t>/spy</w:t>
+      </w:r>
+      <w:r>
+        <w:rPr>
+          <w:rFonts w:ascii="Vazir" w:hAnsi="Vazir" w:cs="Vazir"/>
+          <w:lang w:val="en" w:bidi="fa-IR"/>
+        </w:rPr>
+        <w:t xml:space="preserve"> </w:t>
+      </w:r>
+      <w:r>
+        <w:rPr>
+          <w:rFonts w:ascii="Vazir" w:hAnsi="Vazir" w:cs="Vazir"/>
+          <w:lang w:val="en" w:bidi="fa-IR"/>
+        </w:rPr>
+        <w:t>/sessions/{id}/timer/pause/</w:t>
       </w:r>
     </w:p>
     <w:p>
@@ -11875,7 +11933,28 @@
           <w:rFonts w:ascii="Vazir" w:hAnsi="Vazir" w:cs="Vazir"/>
           <w:lang w:val="en" w:bidi="fa-IR"/>
         </w:rPr>
-        <w:t>POST /games/sessions/{id}/timer/resume/</w:t>
+        <w:t>POST /games</w:t>
+      </w:r>
+      <w:r>
+        <w:rPr>
+          <w:rFonts w:ascii="Vazir" w:hAnsi="Vazir" w:cs="Vazir"/>
+          <w:lang w:val="en" w:bidi="fa-IR"/>
+        </w:rPr>
+        <w:t>/spy</w:t>
+      </w:r>
+      <w:r>
+        <w:rPr>
+          <w:rFonts w:ascii="Vazir" w:hAnsi="Vazir" w:cs="Vazir"/>
+          <w:lang w:val="en" w:bidi="fa-IR"/>
+        </w:rPr>
+        <w:t xml:space="preserve"> </w:t>
+      </w:r>
+      <w:r>
+        <w:rPr>
+          <w:rFonts w:ascii="Vazir" w:hAnsi="Vazir" w:cs="Vazir"/>
+          <w:lang w:val="en" w:bidi="fa-IR"/>
+        </w:rPr>
+        <w:t>/sessions/{id}/timer/resume/</w:t>
       </w:r>
     </w:p>
     <w:p>
@@ -11911,7 +11990,28 @@
           <w:rFonts w:ascii="Vazir" w:hAnsi="Vazir" w:cs="Vazir"/>
           <w:lang w:val="en" w:bidi="fa-IR"/>
         </w:rPr>
-        <w:t>POST /games/sessions/{id}/timer/stop/</w:t>
+        <w:t>POST /games</w:t>
+      </w:r>
+      <w:r>
+        <w:rPr>
+          <w:rFonts w:ascii="Vazir" w:hAnsi="Vazir" w:cs="Vazir"/>
+          <w:lang w:val="en" w:bidi="fa-IR"/>
+        </w:rPr>
+        <w:t>/spy</w:t>
+      </w:r>
+      <w:r>
+        <w:rPr>
+          <w:rFonts w:ascii="Vazir" w:hAnsi="Vazir" w:cs="Vazir"/>
+          <w:lang w:val="en" w:bidi="fa-IR"/>
+        </w:rPr>
+        <w:t xml:space="preserve"> </w:t>
+      </w:r>
+      <w:r>
+        <w:rPr>
+          <w:rFonts w:ascii="Vazir" w:hAnsi="Vazir" w:cs="Vazir"/>
+          <w:lang w:val="en" w:bidi="fa-IR"/>
+        </w:rPr>
+        <w:t>/sessions/{id}/timer/stop/</w:t>
       </w:r>
     </w:p>
     <w:p>
@@ -12102,6 +12202,7 @@
           <w:szCs w:val="28"/>
           <w:lang w:val="en" w:bidi="fa-IR"/>
         </w:rPr>
+        <w:lastRenderedPageBreak/>
         <w:t>UC-07 | End Game</w:t>
       </w:r>
     </w:p>
@@ -12354,7 +12455,28 @@
           <w:rFonts w:ascii="Vazir" w:hAnsi="Vazir" w:cs="Vazir"/>
           <w:lang w:val="en" w:bidi="fa-IR"/>
         </w:rPr>
-        <w:t xml:space="preserve">POST /games/sessions/{id}/vote/ </w:t>
+        <w:t>POST /games</w:t>
+      </w:r>
+      <w:r>
+        <w:rPr>
+          <w:rFonts w:ascii="Vazir" w:hAnsi="Vazir" w:cs="Vazir"/>
+          <w:lang w:val="en" w:bidi="fa-IR"/>
+        </w:rPr>
+        <w:t>/spy</w:t>
+      </w:r>
+      <w:r>
+        <w:rPr>
+          <w:rFonts w:ascii="Vazir" w:hAnsi="Vazir" w:cs="Vazir"/>
+          <w:lang w:val="en" w:bidi="fa-IR"/>
+        </w:rPr>
+        <w:t xml:space="preserve"> </w:t>
+      </w:r>
+      <w:r>
+        <w:rPr>
+          <w:rFonts w:ascii="Vazir" w:hAnsi="Vazir" w:cs="Vazir"/>
+          <w:lang w:val="en" w:bidi="fa-IR"/>
+        </w:rPr>
+        <w:t xml:space="preserve">/sessions/{id}/vote/ </w:t>
       </w:r>
       <w:r>
         <w:rPr>
@@ -12600,7 +12722,28 @@
           <w:rFonts w:ascii="Vazir" w:hAnsi="Vazir" w:cs="Vazir"/>
           <w:lang w:val="en" w:bidi="fa-IR"/>
         </w:rPr>
-        <w:t xml:space="preserve">POST /games/sessions/{id}/spy-guess/ </w:t>
+        <w:t>POST /games</w:t>
+      </w:r>
+      <w:r>
+        <w:rPr>
+          <w:rFonts w:ascii="Vazir" w:hAnsi="Vazir" w:cs="Vazir"/>
+          <w:lang w:val="en" w:bidi="fa-IR"/>
+        </w:rPr>
+        <w:t>/spy</w:t>
+      </w:r>
+      <w:r>
+        <w:rPr>
+          <w:rFonts w:ascii="Vazir" w:hAnsi="Vazir" w:cs="Vazir"/>
+          <w:lang w:val="en" w:bidi="fa-IR"/>
+        </w:rPr>
+        <w:t xml:space="preserve"> </w:t>
+      </w:r>
+      <w:r>
+        <w:rPr>
+          <w:rFonts w:ascii="Vazir" w:hAnsi="Vazir" w:cs="Vazir"/>
+          <w:lang w:val="en" w:bidi="fa-IR"/>
+        </w:rPr>
+        <w:t xml:space="preserve">/sessions/{id}/spy-guess/ </w:t>
       </w:r>
       <w:r>
         <w:rPr>
@@ -12898,7 +13041,6 @@
                 <w:rtl/>
                 <w:lang w:val="en"/>
               </w:rPr>
-              <w:lastRenderedPageBreak/>
               <w:t>حالت</w:t>
             </w:r>
           </w:p>
@@ -13045,6 +13187,7 @@
                 <w:rtl/>
                 <w:lang w:val="en" w:bidi="fa-IR"/>
               </w:rPr>
+              <w:lastRenderedPageBreak/>
               <w:t>جاسوس شناسایی شد + حدس درست</w:t>
             </w:r>
           </w:p>
@@ -13768,7 +13911,28 @@
           <w:rFonts w:ascii="Vazir" w:hAnsi="Vazir" w:cs="Vazir"/>
           <w:lang w:val="en" w:bidi="fa-IR"/>
         </w:rPr>
-        <w:t xml:space="preserve">GET /games/sessions/?status=FINISHED </w:t>
+        <w:t>GET /games</w:t>
+      </w:r>
+      <w:r>
+        <w:rPr>
+          <w:rFonts w:ascii="Vazir" w:hAnsi="Vazir" w:cs="Vazir"/>
+          <w:lang w:val="en" w:bidi="fa-IR"/>
+        </w:rPr>
+        <w:t>/spy</w:t>
+      </w:r>
+      <w:r>
+        <w:rPr>
+          <w:rFonts w:ascii="Vazir" w:hAnsi="Vazir" w:cs="Vazir"/>
+          <w:lang w:val="en" w:bidi="fa-IR"/>
+        </w:rPr>
+        <w:t xml:space="preserve"> </w:t>
+      </w:r>
+      <w:r>
+        <w:rPr>
+          <w:rFonts w:ascii="Vazir" w:hAnsi="Vazir" w:cs="Vazir"/>
+          <w:lang w:val="en" w:bidi="fa-IR"/>
+        </w:rPr>
+        <w:t xml:space="preserve">/sessions/?status=FINISHED </w:t>
       </w:r>
       <w:r>
         <w:rPr>
@@ -13916,8 +14080,28 @@
           <w:rFonts w:ascii="Vazir" w:hAnsi="Vazir" w:cs="Vazir" w:hint="cs"/>
           <w:lang w:bidi="fa-IR"/>
         </w:rPr>
-        <w:lastRenderedPageBreak/>
-        <w:t>GET /games/sessions/{id}</w:t>
+        <w:t>GET /games</w:t>
+      </w:r>
+      <w:r>
+        <w:rPr>
+          <w:rFonts w:ascii="Vazir" w:hAnsi="Vazir" w:cs="Vazir"/>
+          <w:lang w:val="en" w:bidi="fa-IR"/>
+        </w:rPr>
+        <w:t>/spy</w:t>
+      </w:r>
+      <w:r>
+        <w:rPr>
+          <w:rFonts w:ascii="Vazir" w:hAnsi="Vazir" w:cs="Vazir" w:hint="cs"/>
+          <w:lang w:bidi="fa-IR"/>
+        </w:rPr>
+        <w:t xml:space="preserve"> </w:t>
+      </w:r>
+      <w:r>
+        <w:rPr>
+          <w:rFonts w:ascii="Vazir" w:hAnsi="Vazir" w:cs="Vazir" w:hint="cs"/>
+          <w:lang w:bidi="fa-IR"/>
+        </w:rPr>
+        <w:t>/sessions/{id}</w:t>
       </w:r>
       <w:r>
         <w:rPr>

</xml_diff>

<commit_message>
fix some security problems
</commit_message>
<xml_diff>
--- a/Documents/BaziGardan_doc.docx
+++ b/Documents/BaziGardan_doc.docx
@@ -1891,12 +1891,21 @@
         </w:rPr>
         <w:t xml:space="preserve"> استفاده از </w:t>
       </w:r>
-      <w:r>
-        <w:rPr>
-          <w:rFonts w:ascii="Vazir" w:hAnsi="Vazir" w:cs="Vazir" w:hint="cs"/>
-          <w:lang w:bidi="fa-IR"/>
-        </w:rPr>
-        <w:t>drf-spectacular</w:t>
+      <w:proofErr w:type="spellStart"/>
+      <w:r>
+        <w:rPr>
+          <w:rFonts w:ascii="Vazir" w:hAnsi="Vazir" w:cs="Vazir" w:hint="cs"/>
+          <w:lang w:bidi="fa-IR"/>
+        </w:rPr>
+        <w:t>drf</w:t>
+      </w:r>
+      <w:proofErr w:type="spellEnd"/>
+      <w:r>
+        <w:rPr>
+          <w:rFonts w:ascii="Vazir" w:hAnsi="Vazir" w:cs="Vazir" w:hint="cs"/>
+          <w:lang w:bidi="fa-IR"/>
+        </w:rPr>
+        <w:t>-spectacular</w:t>
       </w:r>
       <w:r>
         <w:rPr>
@@ -1906,12 +1915,21 @@
         </w:rPr>
         <w:t xml:space="preserve"> برای </w:t>
       </w:r>
-      <w:r>
-        <w:rPr>
-          <w:rFonts w:ascii="Vazir" w:hAnsi="Vazir" w:cs="Vazir" w:hint="cs"/>
-          <w:lang w:bidi="fa-IR"/>
-        </w:rPr>
-        <w:t>OpenAPI Schema</w:t>
+      <w:proofErr w:type="spellStart"/>
+      <w:r>
+        <w:rPr>
+          <w:rFonts w:ascii="Vazir" w:hAnsi="Vazir" w:cs="Vazir" w:hint="cs"/>
+          <w:lang w:bidi="fa-IR"/>
+        </w:rPr>
+        <w:t>OpenAPI</w:t>
+      </w:r>
+      <w:proofErr w:type="spellEnd"/>
+      <w:r>
+        <w:rPr>
+          <w:rFonts w:ascii="Vazir" w:hAnsi="Vazir" w:cs="Vazir" w:hint="cs"/>
+          <w:lang w:bidi="fa-IR"/>
+        </w:rPr>
+        <w:t xml:space="preserve"> Schema</w:t>
       </w:r>
     </w:p>
     <w:p>
@@ -2035,6 +2053,7 @@
         </w:rPr>
         <w:t xml:space="preserve"> &lt; ۲۰۰</w:t>
       </w:r>
+      <w:proofErr w:type="spellStart"/>
       <w:r>
         <w:rPr>
           <w:rFonts w:ascii="Vazir" w:hAnsi="Vazir" w:cs="Vazir" w:hint="cs"/>
@@ -2042,6 +2061,7 @@
         </w:rPr>
         <w:t>ms</w:t>
       </w:r>
+      <w:proofErr w:type="spellEnd"/>
     </w:p>
     <w:p>
       <w:pPr>
@@ -8056,7 +8076,39 @@
           <w:rFonts w:ascii="Vazir" w:hAnsi="Vazir" w:cs="Vazir"/>
           <w:lang w:val="en" w:bidi="fa-IR"/>
         </w:rPr>
-        <w:t>{access_token, refresh_token}</w:t>
+        <w:t>{</w:t>
+      </w:r>
+      <w:proofErr w:type="spellStart"/>
+      <w:r>
+        <w:rPr>
+          <w:rFonts w:ascii="Vazir" w:hAnsi="Vazir" w:cs="Vazir"/>
+          <w:lang w:val="en" w:bidi="fa-IR"/>
+        </w:rPr>
+        <w:t>access_token</w:t>
+      </w:r>
+      <w:proofErr w:type="spellEnd"/>
+      <w:r>
+        <w:rPr>
+          <w:rFonts w:ascii="Vazir" w:hAnsi="Vazir" w:cs="Vazir"/>
+          <w:lang w:val="en" w:bidi="fa-IR"/>
+        </w:rPr>
+        <w:t xml:space="preserve">, </w:t>
+      </w:r>
+      <w:proofErr w:type="spellStart"/>
+      <w:r>
+        <w:rPr>
+          <w:rFonts w:ascii="Vazir" w:hAnsi="Vazir" w:cs="Vazir"/>
+          <w:lang w:val="en" w:bidi="fa-IR"/>
+        </w:rPr>
+        <w:t>refresh_token</w:t>
+      </w:r>
+      <w:proofErr w:type="spellEnd"/>
+      <w:r>
+        <w:rPr>
+          <w:rFonts w:ascii="Vazir" w:hAnsi="Vazir" w:cs="Vazir"/>
+          <w:lang w:val="en" w:bidi="fa-IR"/>
+        </w:rPr>
+        <w:t>}</w:t>
       </w:r>
     </w:p>
     <w:p>
@@ -8160,7 +8212,39 @@
           <w:rFonts w:ascii="Vazir" w:hAnsi="Vazir" w:cs="Vazir"/>
           <w:lang w:val="en" w:bidi="fa-IR"/>
         </w:rPr>
-        <w:t>{access_token, refresh_token}</w:t>
+        <w:t>{</w:t>
+      </w:r>
+      <w:proofErr w:type="spellStart"/>
+      <w:r>
+        <w:rPr>
+          <w:rFonts w:ascii="Vazir" w:hAnsi="Vazir" w:cs="Vazir"/>
+          <w:lang w:val="en" w:bidi="fa-IR"/>
+        </w:rPr>
+        <w:t>access_token</w:t>
+      </w:r>
+      <w:proofErr w:type="spellEnd"/>
+      <w:r>
+        <w:rPr>
+          <w:rFonts w:ascii="Vazir" w:hAnsi="Vazir" w:cs="Vazir"/>
+          <w:lang w:val="en" w:bidi="fa-IR"/>
+        </w:rPr>
+        <w:t xml:space="preserve">, </w:t>
+      </w:r>
+      <w:proofErr w:type="spellStart"/>
+      <w:r>
+        <w:rPr>
+          <w:rFonts w:ascii="Vazir" w:hAnsi="Vazir" w:cs="Vazir"/>
+          <w:lang w:val="en" w:bidi="fa-IR"/>
+        </w:rPr>
+        <w:t>refresh_token</w:t>
+      </w:r>
+      <w:proofErr w:type="spellEnd"/>
+      <w:r>
+        <w:rPr>
+          <w:rFonts w:ascii="Vazir" w:hAnsi="Vazir" w:cs="Vazir"/>
+          <w:lang w:val="en" w:bidi="fa-IR"/>
+        </w:rPr>
+        <w:t>}</w:t>
       </w:r>
     </w:p>
     <w:p>
@@ -8210,7 +8294,23 @@
           <w:rFonts w:ascii="Vazir" w:hAnsi="Vazir" w:cs="Vazir"/>
           <w:lang w:val="en" w:bidi="fa-IR"/>
         </w:rPr>
-        <w:t xml:space="preserve"> {refresh_token}</w:t>
+        <w:t xml:space="preserve"> {</w:t>
+      </w:r>
+      <w:proofErr w:type="spellStart"/>
+      <w:r>
+        <w:rPr>
+          <w:rFonts w:ascii="Vazir" w:hAnsi="Vazir" w:cs="Vazir"/>
+          <w:lang w:val="en" w:bidi="fa-IR"/>
+        </w:rPr>
+        <w:t>refresh_token</w:t>
+      </w:r>
+      <w:proofErr w:type="spellEnd"/>
+      <w:r>
+        <w:rPr>
+          <w:rFonts w:ascii="Vazir" w:hAnsi="Vazir" w:cs="Vazir"/>
+          <w:lang w:val="en" w:bidi="fa-IR"/>
+        </w:rPr>
+        <w:t>}</w:t>
       </w:r>
     </w:p>
     <w:p>
@@ -8231,12 +8331,21 @@
         </w:rPr>
         <w:t xml:space="preserve">برگرداندن </w:t>
       </w:r>
-      <w:r>
-        <w:rPr>
-          <w:rFonts w:ascii="Vazir" w:hAnsi="Vazir" w:cs="Vazir"/>
-          <w:lang w:val="en" w:bidi="fa-IR"/>
-        </w:rPr>
-        <w:t xml:space="preserve">access_token </w:t>
+      <w:proofErr w:type="spellStart"/>
+      <w:r>
+        <w:rPr>
+          <w:rFonts w:ascii="Vazir" w:hAnsi="Vazir" w:cs="Vazir"/>
+          <w:lang w:val="en" w:bidi="fa-IR"/>
+        </w:rPr>
+        <w:t>access_token</w:t>
+      </w:r>
+      <w:proofErr w:type="spellEnd"/>
+      <w:r>
+        <w:rPr>
+          <w:rFonts w:ascii="Vazir" w:hAnsi="Vazir" w:cs="Vazir"/>
+          <w:lang w:val="en" w:bidi="fa-IR"/>
+        </w:rPr>
+        <w:t xml:space="preserve"> </w:t>
       </w:r>
       <w:r>
         <w:rPr>
@@ -8791,7 +8900,23 @@
           <w:rFonts w:ascii="Vazir" w:hAnsi="Vazir" w:cs="Vazir"/>
           <w:lang w:val="en" w:bidi="fa-IR"/>
         </w:rPr>
-        <w:t xml:space="preserve"> {username?, email?}</w:t>
+        <w:t xml:space="preserve"> {</w:t>
+      </w:r>
+      <w:proofErr w:type="gramStart"/>
+      <w:r>
+        <w:rPr>
+          <w:rFonts w:ascii="Vazir" w:hAnsi="Vazir" w:cs="Vazir"/>
+          <w:lang w:val="en" w:bidi="fa-IR"/>
+        </w:rPr>
+        <w:t>username?,</w:t>
+      </w:r>
+      <w:proofErr w:type="gramEnd"/>
+      <w:r>
+        <w:rPr>
+          <w:rFonts w:ascii="Vazir" w:hAnsi="Vazir" w:cs="Vazir"/>
+          <w:lang w:val="en" w:bidi="fa-IR"/>
+        </w:rPr>
+        <w:t xml:space="preserve"> email?}</w:t>
       </w:r>
     </w:p>
     <w:p>
@@ -8879,7 +9004,39 @@
           <w:rFonts w:ascii="Vazir" w:hAnsi="Vazir" w:cs="Vazir"/>
           <w:lang w:val="en" w:bidi="fa-IR"/>
         </w:rPr>
-        <w:t xml:space="preserve"> {old_password, new_password}</w:t>
+        <w:t xml:space="preserve"> {</w:t>
+      </w:r>
+      <w:proofErr w:type="spellStart"/>
+      <w:r>
+        <w:rPr>
+          <w:rFonts w:ascii="Vazir" w:hAnsi="Vazir" w:cs="Vazir"/>
+          <w:lang w:val="en" w:bidi="fa-IR"/>
+        </w:rPr>
+        <w:t>old_password</w:t>
+      </w:r>
+      <w:proofErr w:type="spellEnd"/>
+      <w:r>
+        <w:rPr>
+          <w:rFonts w:ascii="Vazir" w:hAnsi="Vazir" w:cs="Vazir"/>
+          <w:lang w:val="en" w:bidi="fa-IR"/>
+        </w:rPr>
+        <w:t xml:space="preserve">, </w:t>
+      </w:r>
+      <w:proofErr w:type="spellStart"/>
+      <w:r>
+        <w:rPr>
+          <w:rFonts w:ascii="Vazir" w:hAnsi="Vazir" w:cs="Vazir"/>
+          <w:lang w:val="en" w:bidi="fa-IR"/>
+        </w:rPr>
+        <w:t>new_password</w:t>
+      </w:r>
+      <w:proofErr w:type="spellEnd"/>
+      <w:r>
+        <w:rPr>
+          <w:rFonts w:ascii="Vazir" w:hAnsi="Vazir" w:cs="Vazir"/>
+          <w:lang w:val="en" w:bidi="fa-IR"/>
+        </w:rPr>
+        <w:t>}</w:t>
       </w:r>
     </w:p>
     <w:p>
@@ -10074,6 +10231,7 @@
         </w:rPr>
         <w:t xml:space="preserve">                                            </w:t>
       </w:r>
+      <w:proofErr w:type="spellStart"/>
       <w:r>
         <w:rPr>
           <w:rFonts w:ascii="Vazir" w:hAnsi="Vazir" w:cs="Vazir"/>
@@ -10083,13 +10241,23 @@
         </w:rPr>
         <w:t>content_copy</w:t>
       </w:r>
-      <w:r>
-        <w:rPr>
-          <w:rFonts w:ascii="Vazir" w:hAnsi="Vazir" w:cs="Vazir"/>
-          <w:lang w:bidi="fa-IR"/>
-        </w:rPr>
-        <w:t xml:space="preserve">                        json</w:t>
-      </w:r>
+      <w:proofErr w:type="spellEnd"/>
+      <w:r>
+        <w:rPr>
+          <w:rFonts w:ascii="Vazir" w:hAnsi="Vazir" w:cs="Vazir"/>
+          <w:lang w:bidi="fa-IR"/>
+        </w:rPr>
+        <w:t xml:space="preserve">                        </w:t>
+      </w:r>
+      <w:proofErr w:type="spellStart"/>
+      <w:r>
+        <w:rPr>
+          <w:rFonts w:ascii="Vazir" w:hAnsi="Vazir" w:cs="Vazir"/>
+          <w:lang w:bidi="fa-IR"/>
+        </w:rPr>
+        <w:t>json</w:t>
+      </w:r>
+      <w:proofErr w:type="spellEnd"/>
     </w:p>
     <w:p>
       <w:pPr>
@@ -10118,22 +10286,72 @@
           <w:rFonts w:ascii="Vazir" w:hAnsi="Vazir" w:cs="Vazir"/>
           <w:lang w:bidi="fa-IR"/>
         </w:rPr>
-        <w:t xml:space="preserve">  "timer_duration": 480,</w:t>
-      </w:r>
-    </w:p>
-    <w:p>
-      <w:pPr>
-        <w:rPr>
-          <w:rFonts w:ascii="Vazir" w:hAnsi="Vazir" w:cs="Vazir"/>
-          <w:lang w:bidi="fa-IR"/>
-        </w:rPr>
-      </w:pPr>
-      <w:r>
-        <w:rPr>
-          <w:rFonts w:ascii="Vazir" w:hAnsi="Vazir" w:cs="Vazir"/>
-          <w:lang w:bidi="fa-IR"/>
-        </w:rPr>
-        <w:t xml:space="preserve">  "spy_count": 1,</w:t>
+        <w:t xml:space="preserve">  "</w:t>
+      </w:r>
+      <w:proofErr w:type="spellStart"/>
+      <w:proofErr w:type="gramStart"/>
+      <w:r>
+        <w:rPr>
+          <w:rFonts w:ascii="Vazir" w:hAnsi="Vazir" w:cs="Vazir"/>
+          <w:lang w:bidi="fa-IR"/>
+        </w:rPr>
+        <w:t>timer</w:t>
+      </w:r>
+      <w:proofErr w:type="gramEnd"/>
+      <w:r>
+        <w:rPr>
+          <w:rFonts w:ascii="Vazir" w:hAnsi="Vazir" w:cs="Vazir"/>
+          <w:lang w:bidi="fa-IR"/>
+        </w:rPr>
+        <w:t>_duration</w:t>
+      </w:r>
+      <w:proofErr w:type="spellEnd"/>
+      <w:r>
+        <w:rPr>
+          <w:rFonts w:ascii="Vazir" w:hAnsi="Vazir" w:cs="Vazir"/>
+          <w:lang w:bidi="fa-IR"/>
+        </w:rPr>
+        <w:t>": 480,</w:t>
+      </w:r>
+    </w:p>
+    <w:p>
+      <w:pPr>
+        <w:rPr>
+          <w:rFonts w:ascii="Vazir" w:hAnsi="Vazir" w:cs="Vazir"/>
+          <w:lang w:bidi="fa-IR"/>
+        </w:rPr>
+      </w:pPr>
+      <w:r>
+        <w:rPr>
+          <w:rFonts w:ascii="Vazir" w:hAnsi="Vazir" w:cs="Vazir"/>
+          <w:lang w:bidi="fa-IR"/>
+        </w:rPr>
+        <w:t xml:space="preserve">  "</w:t>
+      </w:r>
+      <w:proofErr w:type="spellStart"/>
+      <w:proofErr w:type="gramStart"/>
+      <w:r>
+        <w:rPr>
+          <w:rFonts w:ascii="Vazir" w:hAnsi="Vazir" w:cs="Vazir"/>
+          <w:lang w:bidi="fa-IR"/>
+        </w:rPr>
+        <w:t>spy</w:t>
+      </w:r>
+      <w:proofErr w:type="gramEnd"/>
+      <w:r>
+        <w:rPr>
+          <w:rFonts w:ascii="Vazir" w:hAnsi="Vazir" w:cs="Vazir"/>
+          <w:lang w:bidi="fa-IR"/>
+        </w:rPr>
+        <w:t>_count</w:t>
+      </w:r>
+      <w:proofErr w:type="spellEnd"/>
+      <w:r>
+        <w:rPr>
+          <w:rFonts w:ascii="Vazir" w:hAnsi="Vazir" w:cs="Vazir"/>
+          <w:lang w:bidi="fa-IR"/>
+        </w:rPr>
+        <w:t>": 1,</w:t>
       </w:r>
     </w:p>
     <w:p>
@@ -10163,7 +10381,23 @@
           <w:rFonts w:ascii="Vazir" w:hAnsi="Vazir" w:cs="Vazir"/>
           <w:lang w:bidi="fa-IR"/>
         </w:rPr>
-        <w:t xml:space="preserve">    {"friend_id": 5},</w:t>
+        <w:t xml:space="preserve">    {"</w:t>
+      </w:r>
+      <w:proofErr w:type="spellStart"/>
+      <w:r>
+        <w:rPr>
+          <w:rFonts w:ascii="Vazir" w:hAnsi="Vazir" w:cs="Vazir"/>
+          <w:lang w:bidi="fa-IR"/>
+        </w:rPr>
+        <w:t>friend_id</w:t>
+      </w:r>
+      <w:proofErr w:type="spellEnd"/>
+      <w:r>
+        <w:rPr>
+          <w:rFonts w:ascii="Vazir" w:hAnsi="Vazir" w:cs="Vazir"/>
+          <w:lang w:bidi="fa-IR"/>
+        </w:rPr>
+        <w:t>": 5},</w:t>
       </w:r>
     </w:p>
     <w:p>
@@ -10313,6 +10547,7 @@
         </w:rPr>
         <w:t xml:space="preserve">ایجاد </w:t>
       </w:r>
+      <w:proofErr w:type="spellStart"/>
       <w:r>
         <w:rPr>
           <w:rFonts w:ascii="Vazir" w:hAnsi="Vazir" w:cs="Vazir" w:hint="cs"/>
@@ -10320,6 +10555,7 @@
         </w:rPr>
         <w:t>GameSession</w:t>
       </w:r>
+      <w:proofErr w:type="spellEnd"/>
       <w:r>
         <w:rPr>
           <w:rFonts w:ascii="Vazir" w:hAnsi="Vazir" w:cs="Vazir" w:hint="cs"/>
@@ -10359,6 +10595,7 @@
         </w:rPr>
         <w:t xml:space="preserve"> برگرداندن </w:t>
       </w:r>
+      <w:proofErr w:type="spellStart"/>
       <w:r>
         <w:rPr>
           <w:rFonts w:ascii="Vazir" w:hAnsi="Vazir" w:cs="Vazir" w:hint="cs"/>
@@ -10366,6 +10603,7 @@
         </w:rPr>
         <w:t>session_id</w:t>
       </w:r>
+      <w:proofErr w:type="spellEnd"/>
     </w:p>
     <w:p>
       <w:pPr>
@@ -10500,12 +10738,21 @@
           <w:lang w:val="en" w:bidi="fa-IR"/>
         </w:rPr>
       </w:pPr>
-      <w:r>
-        <w:rPr>
-          <w:rFonts w:ascii="Vazir" w:hAnsi="Vazir" w:cs="Vazir"/>
-          <w:lang w:val="en" w:bidi="fa-IR"/>
-        </w:rPr>
-        <w:t xml:space="preserve">timer_duration </w:t>
+      <w:proofErr w:type="spellStart"/>
+      <w:r>
+        <w:rPr>
+          <w:rFonts w:ascii="Vazir" w:hAnsi="Vazir" w:cs="Vazir"/>
+          <w:lang w:val="en" w:bidi="fa-IR"/>
+        </w:rPr>
+        <w:t>timer_duration</w:t>
+      </w:r>
+      <w:proofErr w:type="spellEnd"/>
+      <w:r>
+        <w:rPr>
+          <w:rFonts w:ascii="Vazir" w:hAnsi="Vazir" w:cs="Vazir"/>
+          <w:lang w:val="en" w:bidi="fa-IR"/>
+        </w:rPr>
+        <w:t xml:space="preserve"> </w:t>
       </w:r>
       <w:r>
         <w:rPr>
@@ -10750,12 +10997,23 @@
                 <w:lang w:val="en" w:bidi="fa-IR"/>
               </w:rPr>
             </w:pPr>
+            <w:proofErr w:type="spellStart"/>
+            <w:proofErr w:type="gramStart"/>
             <w:r>
               <w:rPr>
                 <w:rFonts w:ascii="Vazir" w:hAnsi="Vazir" w:cs="Vazir"/>
                 <w:lang w:val="en" w:bidi="fa-IR"/>
               </w:rPr>
-              <w:t>session.status == ROLE_REVEAL</w:t>
+              <w:t>session.status</w:t>
+            </w:r>
+            <w:proofErr w:type="spellEnd"/>
+            <w:proofErr w:type="gramEnd"/>
+            <w:r>
+              <w:rPr>
+                <w:rFonts w:ascii="Vazir" w:hAnsi="Vazir" w:cs="Vazir"/>
+                <w:lang w:val="en" w:bidi="fa-IR"/>
+              </w:rPr>
+              <w:t xml:space="preserve"> == ROLE_REVEAL</w:t>
             </w:r>
           </w:p>
         </w:tc>
@@ -10849,6 +11107,7 @@
         </w:rPr>
         <w:t xml:space="preserve">{ </w:t>
       </w:r>
+      <w:proofErr w:type="spellStart"/>
       <w:r>
         <w:rPr>
           <w:rFonts w:ascii="Vazir" w:hAnsi="Vazir" w:cs="Vazir" w:hint="cs"/>
@@ -10856,6 +11115,7 @@
         </w:rPr>
         <w:t>pending_players</w:t>
       </w:r>
+      <w:proofErr w:type="spellEnd"/>
       <w:r>
         <w:rPr>
           <w:rFonts w:ascii="Vazir" w:hAnsi="Vazir" w:cs="Vazir" w:hint="cs"/>
@@ -10934,7 +11194,39 @@
           <w:rFonts w:ascii="Vazir" w:hAnsi="Vazir" w:cs="Vazir"/>
           <w:lang w:val="en" w:bidi="fa-IR"/>
         </w:rPr>
-        <w:t xml:space="preserve"> { player_name: "</w:t>
+        <w:t xml:space="preserve"> </w:t>
+      </w:r>
+      <w:proofErr w:type="gramStart"/>
+      <w:r>
+        <w:rPr>
+          <w:rFonts w:ascii="Vazir" w:hAnsi="Vazir" w:cs="Vazir"/>
+          <w:lang w:val="en" w:bidi="fa-IR"/>
+        </w:rPr>
+        <w:t xml:space="preserve">{ </w:t>
+      </w:r>
+      <w:proofErr w:type="spellStart"/>
+      <w:r>
+        <w:rPr>
+          <w:rFonts w:ascii="Vazir" w:hAnsi="Vazir" w:cs="Vazir"/>
+          <w:lang w:val="en" w:bidi="fa-IR"/>
+        </w:rPr>
+        <w:t>player</w:t>
+      </w:r>
+      <w:proofErr w:type="gramEnd"/>
+      <w:r>
+        <w:rPr>
+          <w:rFonts w:ascii="Vazir" w:hAnsi="Vazir" w:cs="Vazir"/>
+          <w:lang w:val="en" w:bidi="fa-IR"/>
+        </w:rPr>
+        <w:t>_name</w:t>
+      </w:r>
+      <w:proofErr w:type="spellEnd"/>
+      <w:r>
+        <w:rPr>
+          <w:rFonts w:ascii="Vazir" w:hAnsi="Vazir" w:cs="Vazir"/>
+          <w:lang w:val="en" w:bidi="fa-IR"/>
+        </w:rPr>
+        <w:t>: "</w:t>
       </w:r>
       <w:r>
         <w:rPr>
@@ -10944,6 +11236,7 @@
         </w:rPr>
         <w:t>علی</w:t>
       </w:r>
+      <w:proofErr w:type="gramStart"/>
       <w:r>
         <w:rPr>
           <w:rFonts w:ascii="Vazir" w:hAnsi="Vazir" w:cs="Vazir"/>
@@ -10951,6 +11244,7 @@
         </w:rPr>
         <w:t>" }</w:t>
       </w:r>
+      <w:proofErr w:type="gramEnd"/>
     </w:p>
     <w:p>
       <w:pPr>
@@ -11096,6 +11390,7 @@
         </w:rPr>
         <w:t xml:space="preserve">نام بازیکن از </w:t>
       </w:r>
+      <w:proofErr w:type="spellStart"/>
       <w:r>
         <w:rPr>
           <w:rFonts w:ascii="Vazir" w:hAnsi="Vazir" w:cs="Vazir" w:hint="cs"/>
@@ -11103,6 +11398,7 @@
         </w:rPr>
         <w:t>pending_players</w:t>
       </w:r>
+      <w:proofErr w:type="spellEnd"/>
       <w:r>
         <w:rPr>
           <w:rFonts w:ascii="Vazir" w:hAnsi="Vazir" w:cs="Vazir" w:hint="cs"/>
@@ -11132,6 +11428,7 @@
         </w:rPr>
         <w:t xml:space="preserve">تکرار تا </w:t>
       </w:r>
+      <w:proofErr w:type="spellStart"/>
       <w:r>
         <w:rPr>
           <w:rFonts w:ascii="Vazir" w:hAnsi="Vazir" w:cs="Vazir" w:hint="cs"/>
@@ -11139,6 +11436,7 @@
         </w:rPr>
         <w:t>pending_players</w:t>
       </w:r>
+      <w:proofErr w:type="spellEnd"/>
       <w:r>
         <w:rPr>
           <w:rFonts w:ascii="Vazir" w:hAnsi="Vazir" w:cs="Vazir" w:hint="cs"/>
@@ -11412,12 +11710,23 @@
                 <w:lang w:val="en" w:bidi="fa-IR"/>
               </w:rPr>
             </w:pPr>
+            <w:proofErr w:type="spellStart"/>
+            <w:proofErr w:type="gramStart"/>
             <w:r>
               <w:rPr>
                 <w:rFonts w:ascii="Vazir" w:hAnsi="Vazir" w:cs="Vazir"/>
                 <w:lang w:val="en" w:bidi="fa-IR"/>
               </w:rPr>
-              <w:t>session.status == IN_PROGRESS</w:t>
+              <w:t>session.status</w:t>
+            </w:r>
+            <w:proofErr w:type="spellEnd"/>
+            <w:proofErr w:type="gramEnd"/>
+            <w:r>
+              <w:rPr>
+                <w:rFonts w:ascii="Vazir" w:hAnsi="Vazir" w:cs="Vazir"/>
+                <w:lang w:val="en" w:bidi="fa-IR"/>
+              </w:rPr>
+              <w:t xml:space="preserve"> == IN_PROGRESS</w:t>
             </w:r>
           </w:p>
         </w:tc>
@@ -11526,12 +11835,21 @@
         </w:rPr>
         <w:t xml:space="preserve"> {</w:t>
       </w:r>
-      <w:r>
-        <w:rPr>
-          <w:rFonts w:ascii="Vazir" w:hAnsi="Vazir" w:cs="Vazir" w:hint="cs"/>
-          <w:lang w:bidi="fa-IR"/>
-        </w:rPr>
-        <w:t>remaining_seconds, status</w:t>
+      <w:proofErr w:type="spellStart"/>
+      <w:r>
+        <w:rPr>
+          <w:rFonts w:ascii="Vazir" w:hAnsi="Vazir" w:cs="Vazir" w:hint="cs"/>
+          <w:lang w:bidi="fa-IR"/>
+        </w:rPr>
+        <w:t>remaining_seconds</w:t>
+      </w:r>
+      <w:proofErr w:type="spellEnd"/>
+      <w:r>
+        <w:rPr>
+          <w:rFonts w:ascii="Vazir" w:hAnsi="Vazir" w:cs="Vazir" w:hint="cs"/>
+          <w:lang w:bidi="fa-IR"/>
+        </w:rPr>
+        <w:t>, status</w:t>
       </w:r>
       <w:r>
         <w:rPr>
@@ -12071,12 +12389,23 @@
                 <w:lang w:val="en" w:bidi="fa-IR"/>
               </w:rPr>
             </w:pPr>
+            <w:proofErr w:type="spellStart"/>
+            <w:proofErr w:type="gramStart"/>
             <w:r>
               <w:rPr>
                 <w:rFonts w:ascii="Vazir" w:hAnsi="Vazir" w:cs="Vazir"/>
                 <w:lang w:val="en" w:bidi="fa-IR"/>
               </w:rPr>
-              <w:t>session.status == VOTING</w:t>
+              <w:t>session.status</w:t>
+            </w:r>
+            <w:proofErr w:type="spellEnd"/>
+            <w:proofErr w:type="gramEnd"/>
+            <w:r>
+              <w:rPr>
+                <w:rFonts w:ascii="Vazir" w:hAnsi="Vazir" w:cs="Vazir"/>
+                <w:lang w:val="en" w:bidi="fa-IR"/>
+              </w:rPr>
+              <w:t xml:space="preserve"> == VOTING</w:t>
             </w:r>
           </w:p>
         </w:tc>
@@ -12161,8 +12490,42 @@
           <w:rFonts w:ascii="Vazir" w:hAnsi="Vazir" w:cs="Vazir"/>
           <w:lang w:val="en" w:bidi="fa-IR"/>
         </w:rPr>
-        <w:t xml:space="preserve"> { "voted_player_id": 3 }</w:t>
-      </w:r>
+        <w:t xml:space="preserve"> </w:t>
+      </w:r>
+      <w:proofErr w:type="gramStart"/>
+      <w:r>
+        <w:rPr>
+          <w:rFonts w:ascii="Vazir" w:hAnsi="Vazir" w:cs="Vazir"/>
+          <w:lang w:val="en" w:bidi="fa-IR"/>
+        </w:rPr>
+        <w:t>{ "</w:t>
+      </w:r>
+      <w:proofErr w:type="spellStart"/>
+      <w:proofErr w:type="gramEnd"/>
+      <w:r>
+        <w:rPr>
+          <w:rFonts w:ascii="Vazir" w:hAnsi="Vazir" w:cs="Vazir"/>
+          <w:lang w:val="en" w:bidi="fa-IR"/>
+        </w:rPr>
+        <w:t>voted_player_id</w:t>
+      </w:r>
+      <w:proofErr w:type="spellEnd"/>
+      <w:r>
+        <w:rPr>
+          <w:rFonts w:ascii="Vazir" w:hAnsi="Vazir" w:cs="Vazir"/>
+          <w:lang w:val="en" w:bidi="fa-IR"/>
+        </w:rPr>
+        <w:t xml:space="preserve">": </w:t>
+      </w:r>
+      <w:proofErr w:type="gramStart"/>
+      <w:r>
+        <w:rPr>
+          <w:rFonts w:ascii="Vazir" w:hAnsi="Vazir" w:cs="Vazir"/>
+          <w:lang w:val="en" w:bidi="fa-IR"/>
+        </w:rPr>
+        <w:t>3 }</w:t>
+      </w:r>
+      <w:proofErr w:type="gramEnd"/>
     </w:p>
     <w:p>
       <w:pPr>
@@ -12394,7 +12757,32 @@
           <w:rFonts w:ascii="Vazir" w:hAnsi="Vazir" w:cs="Vazir"/>
           <w:lang w:val="en" w:bidi="fa-IR"/>
         </w:rPr>
-        <w:t xml:space="preserve"> { "location_guess": "</w:t>
+        <w:t xml:space="preserve"> </w:t>
+      </w:r>
+      <w:proofErr w:type="gramStart"/>
+      <w:r>
+        <w:rPr>
+          <w:rFonts w:ascii="Vazir" w:hAnsi="Vazir" w:cs="Vazir"/>
+          <w:lang w:val="en" w:bidi="fa-IR"/>
+        </w:rPr>
+        <w:t>{ "</w:t>
+      </w:r>
+      <w:proofErr w:type="spellStart"/>
+      <w:proofErr w:type="gramEnd"/>
+      <w:r>
+        <w:rPr>
+          <w:rFonts w:ascii="Vazir" w:hAnsi="Vazir" w:cs="Vazir"/>
+          <w:lang w:val="en" w:bidi="fa-IR"/>
+        </w:rPr>
+        <w:t>location_guess</w:t>
+      </w:r>
+      <w:proofErr w:type="spellEnd"/>
+      <w:r>
+        <w:rPr>
+          <w:rFonts w:ascii="Vazir" w:hAnsi="Vazir" w:cs="Vazir"/>
+          <w:lang w:val="en" w:bidi="fa-IR"/>
+        </w:rPr>
+        <w:t>": "</w:t>
       </w:r>
       <w:r>
         <w:rPr>
@@ -12404,6 +12792,7 @@
         </w:rPr>
         <w:t>کافه</w:t>
       </w:r>
+      <w:proofErr w:type="gramStart"/>
       <w:r>
         <w:rPr>
           <w:rFonts w:ascii="Vazir" w:hAnsi="Vazir" w:cs="Vazir"/>
@@ -12411,6 +12800,7 @@
         </w:rPr>
         <w:t>" }</w:t>
       </w:r>
+      <w:proofErr w:type="gramEnd"/>
     </w:p>
     <w:p>
       <w:pPr>
@@ -13566,6 +13956,7 @@
         </w:rPr>
         <w:t xml:space="preserve">                                            </w:t>
       </w:r>
+      <w:proofErr w:type="spellStart"/>
       <w:r>
         <w:rPr>
           <w:rFonts w:ascii="Vazir" w:hAnsi="Vazir" w:cs="Vazir"/>
@@ -13575,27 +13966,85 @@
         </w:rPr>
         <w:t>content_copy</w:t>
       </w:r>
-      <w:r>
-        <w:rPr>
-          <w:rFonts w:ascii="Vazir" w:hAnsi="Vazir" w:cs="Vazir"/>
-          <w:lang w:bidi="fa-IR"/>
-        </w:rPr>
-        <w:t xml:space="preserve">                        json</w:t>
-      </w:r>
-    </w:p>
-    <w:p>
-      <w:pPr>
-        <w:rPr>
-          <w:rFonts w:ascii="Vazir" w:hAnsi="Vazir" w:cs="Vazir"/>
-          <w:lang w:bidi="fa-IR"/>
-        </w:rPr>
-      </w:pPr>
-      <w:r>
-        <w:rPr>
-          <w:rFonts w:ascii="Vazir" w:hAnsi="Vazir" w:cs="Vazir"/>
-          <w:lang w:bidi="fa-IR"/>
-        </w:rPr>
-        <w:t>[{"id", "game_type", "played_at", "winner", "player_count"}]</w:t>
+      <w:proofErr w:type="spellEnd"/>
+      <w:r>
+        <w:rPr>
+          <w:rFonts w:ascii="Vazir" w:hAnsi="Vazir" w:cs="Vazir"/>
+          <w:lang w:bidi="fa-IR"/>
+        </w:rPr>
+        <w:t xml:space="preserve">                        </w:t>
+      </w:r>
+      <w:proofErr w:type="spellStart"/>
+      <w:r>
+        <w:rPr>
+          <w:rFonts w:ascii="Vazir" w:hAnsi="Vazir" w:cs="Vazir"/>
+          <w:lang w:bidi="fa-IR"/>
+        </w:rPr>
+        <w:t>json</w:t>
+      </w:r>
+      <w:proofErr w:type="spellEnd"/>
+    </w:p>
+    <w:p>
+      <w:pPr>
+        <w:rPr>
+          <w:rFonts w:ascii="Vazir" w:hAnsi="Vazir" w:cs="Vazir"/>
+          <w:lang w:bidi="fa-IR"/>
+        </w:rPr>
+      </w:pPr>
+      <w:r>
+        <w:rPr>
+          <w:rFonts w:ascii="Vazir" w:hAnsi="Vazir" w:cs="Vazir"/>
+          <w:lang w:bidi="fa-IR"/>
+        </w:rPr>
+        <w:t>[{"id", "</w:t>
+      </w:r>
+      <w:proofErr w:type="spellStart"/>
+      <w:r>
+        <w:rPr>
+          <w:rFonts w:ascii="Vazir" w:hAnsi="Vazir" w:cs="Vazir"/>
+          <w:lang w:bidi="fa-IR"/>
+        </w:rPr>
+        <w:t>game_type</w:t>
+      </w:r>
+      <w:proofErr w:type="spellEnd"/>
+      <w:r>
+        <w:rPr>
+          <w:rFonts w:ascii="Vazir" w:hAnsi="Vazir" w:cs="Vazir"/>
+          <w:lang w:bidi="fa-IR"/>
+        </w:rPr>
+        <w:t>", "</w:t>
+      </w:r>
+      <w:proofErr w:type="spellStart"/>
+      <w:r>
+        <w:rPr>
+          <w:rFonts w:ascii="Vazir" w:hAnsi="Vazir" w:cs="Vazir"/>
+          <w:lang w:bidi="fa-IR"/>
+        </w:rPr>
+        <w:t>played_at</w:t>
+      </w:r>
+      <w:proofErr w:type="spellEnd"/>
+      <w:r>
+        <w:rPr>
+          <w:rFonts w:ascii="Vazir" w:hAnsi="Vazir" w:cs="Vazir"/>
+          <w:lang w:bidi="fa-IR"/>
+        </w:rPr>
+        <w:t>", "winner", "</w:t>
+      </w:r>
+      <w:proofErr w:type="spellStart"/>
+      <w:r>
+        <w:rPr>
+          <w:rFonts w:ascii="Vazir" w:hAnsi="Vazir" w:cs="Vazir"/>
+          <w:lang w:bidi="fa-IR"/>
+        </w:rPr>
+        <w:t>player_count</w:t>
+      </w:r>
+      <w:proofErr w:type="spellEnd"/>
+      <w:r>
+        <w:rPr>
+          <w:rFonts w:ascii="Vazir" w:hAnsi="Vazir" w:cs="Vazir"/>
+          <w:lang w:bidi="fa-IR"/>
+        </w:rPr>
+        <w:t>"}]</w:t>
       </w:r>
     </w:p>
     <w:p>
@@ -13980,7 +14429,23 @@
           <w:rFonts w:ascii="Vazir" w:hAnsi="Vazir" w:cs="Vazir"/>
           <w:lang w:val="en" w:bidi="fa-IR"/>
         </w:rPr>
-        <w:t xml:space="preserve"> {refresh_token}</w:t>
+        <w:t xml:space="preserve"> {</w:t>
+      </w:r>
+      <w:proofErr w:type="spellStart"/>
+      <w:r>
+        <w:rPr>
+          <w:rFonts w:ascii="Vazir" w:hAnsi="Vazir" w:cs="Vazir"/>
+          <w:lang w:val="en" w:bidi="fa-IR"/>
+        </w:rPr>
+        <w:t>refresh_token</w:t>
+      </w:r>
+      <w:proofErr w:type="spellEnd"/>
+      <w:r>
+        <w:rPr>
+          <w:rFonts w:ascii="Vazir" w:hAnsi="Vazir" w:cs="Vazir"/>
+          <w:lang w:val="en" w:bidi="fa-IR"/>
+        </w:rPr>
+        <w:t>}</w:t>
       </w:r>
     </w:p>
     <w:p>

</xml_diff>